<commit_message>
personal data agreement revoke mechanism added
</commit_message>
<xml_diff>
--- a/content/legal/personal-data-consent-source.docx
+++ b/content/legal/personal-data-consent-source.docx
@@ -22,16 +22,16 @@
     </w:p>
     <w:p>
       <w:pPr>
-        <w:jc w:val="center"/>
-        <w:rPr>
-          <w:rFonts w:ascii="Times New Roman" w:hAnsi="Times New Roman" w:cs="Times New Roman"/>
-        </w:rPr>
-      </w:pPr>
-      <w:r>
-        <w:rPr>
-          <w:rFonts w:ascii="Times New Roman" w:hAnsi="Times New Roman" w:cs="Times New Roman"/>
-        </w:rPr>
-        <w:t>(далее – Согласие)</w:t>
+        <w:rPr>
+          <w:rFonts w:ascii="Times New Roman" w:hAnsi="Times New Roman" w:cs="Times New Roman"/>
+        </w:rPr>
+      </w:pPr>
+      <w:r>
+        <w:rPr>
+          <w:rFonts w:ascii="Times New Roman" w:hAnsi="Times New Roman" w:cs="Times New Roman"/>
+        </w:rPr>
+        <w:br/>
+        <w:t>(далее — Согласие)</w:t>
       </w:r>
     </w:p>
     <w:p>
@@ -44,21 +44,19 @@
         <w:rPr>
           <w:rFonts w:ascii="Times New Roman" w:hAnsi="Times New Roman" w:cs="Times New Roman"/>
         </w:rPr>
-        <w:t>Я, даю свое согласие ООО «</w:t>
-      </w:r>
-      <w:proofErr w:type="spellStart"/>
-      <w:r>
-        <w:rPr>
-          <w:rFonts w:ascii="Times New Roman" w:hAnsi="Times New Roman" w:cs="Times New Roman"/>
-        </w:rPr>
-        <w:t>МоёПраво</w:t>
-      </w:r>
-      <w:proofErr w:type="spellEnd"/>
-      <w:r>
-        <w:rPr>
-          <w:rFonts w:ascii="Times New Roman" w:hAnsi="Times New Roman" w:cs="Times New Roman"/>
-        </w:rPr>
-        <w:t>» (Далее - Организация) (адрес: Российская Федерация, 117218, г. Москва, Кржижановского улица, д. 19/28), на обработку моих персональных данных, указанных в настоящем согласии, в целях:</w:t>
+        <w:t>Я, даю свое согласие ООО «МоёПраво» (</w:t>
+      </w:r>
+      <w:r>
+        <w:rPr>
+          <w:rFonts w:ascii="Times New Roman" w:hAnsi="Times New Roman" w:cs="Times New Roman"/>
+        </w:rPr>
+        <w:t>Д</w:t>
+      </w:r>
+      <w:r>
+        <w:rPr>
+          <w:rFonts w:ascii="Times New Roman" w:hAnsi="Times New Roman" w:cs="Times New Roman"/>
+        </w:rPr>
+        <w:t>алее — Организация) (адрес: Российская Федерация, 117218, г. Москва, Кржижановского улица, д. 19/28), на обработку моих персональных данных, указанных в настоящем согласии, в целях:</w:t>
       </w:r>
     </w:p>
     <w:p>
@@ -75,7 +73,7 @@
         <w:rPr>
           <w:rFonts w:ascii="Times New Roman" w:hAnsi="Times New Roman" w:cs="Times New Roman"/>
         </w:rPr>
-        <w:t>регистрация и ведение учетной записи;</w:t>
+        <w:t>регистрации и ведения учетной записи;</w:t>
       </w:r>
     </w:p>
     <w:p>
@@ -92,19 +90,7 @@
         <w:rPr>
           <w:rFonts w:ascii="Times New Roman" w:hAnsi="Times New Roman" w:cs="Times New Roman"/>
         </w:rPr>
-        <w:t>п</w:t>
-      </w:r>
-      <w:r>
-        <w:rPr>
-          <w:rFonts w:ascii="Times New Roman" w:hAnsi="Times New Roman" w:cs="Times New Roman"/>
-        </w:rPr>
-        <w:t>редоставление доступа к конструктору договоров и формирование документов</w:t>
-      </w:r>
-      <w:r>
-        <w:rPr>
-          <w:rFonts w:ascii="Times New Roman" w:hAnsi="Times New Roman" w:cs="Times New Roman"/>
-        </w:rPr>
-        <w:t>;</w:t>
+        <w:t>предоставления доступа к конструктору договоров, формирования документов и сохранения черновиков (драфтов) договоров в личном кабинете;</w:t>
       </w:r>
     </w:p>
     <w:p>
@@ -121,7 +107,19 @@
         <w:rPr>
           <w:rFonts w:ascii="Times New Roman" w:hAnsi="Times New Roman" w:cs="Times New Roman"/>
         </w:rPr>
-        <w:t>персонификации услуг и предложений Организации;</w:t>
+        <w:t>обработки запросов</w:t>
+      </w:r>
+      <w:r>
+        <w:rPr>
+          <w:rFonts w:ascii="Times New Roman" w:hAnsi="Times New Roman" w:cs="Times New Roman"/>
+        </w:rPr>
+        <w:t xml:space="preserve"> и обращений пользователей</w:t>
+      </w:r>
+      <w:r>
+        <w:rPr>
+          <w:rFonts w:ascii="Times New Roman" w:hAnsi="Times New Roman" w:cs="Times New Roman"/>
+        </w:rPr>
+        <w:t>;</w:t>
       </w:r>
     </w:p>
     <w:p>
@@ -138,7 +136,7 @@
         <w:rPr>
           <w:rFonts w:ascii="Times New Roman" w:hAnsi="Times New Roman" w:cs="Times New Roman"/>
         </w:rPr>
-        <w:t>улучшения качества предоставляемых услуг и сервисов;</w:t>
+        <w:t>персонализации услуг и предложений Организации;</w:t>
       </w:r>
     </w:p>
     <w:p>
@@ -149,34 +147,13 @@
         </w:numPr>
         <w:rPr>
           <w:rFonts w:ascii="Times New Roman" w:hAnsi="Times New Roman" w:cs="Times New Roman"/>
-          <w:color w:val="EE0000"/>
-        </w:rPr>
-      </w:pPr>
-      <w:r>
-        <w:rPr>
-          <w:rFonts w:ascii="Times New Roman" w:hAnsi="Times New Roman" w:cs="Times New Roman"/>
-        </w:rPr>
-        <w:t>Обработка запросов и обратная связь</w:t>
-      </w:r>
-      <w:r>
-        <w:rPr>
-          <w:rFonts w:ascii="Times New Roman" w:hAnsi="Times New Roman" w:cs="Times New Roman"/>
-        </w:rPr>
-        <w:t xml:space="preserve"> </w:t>
-      </w:r>
-      <w:r>
-        <w:rPr>
-          <w:rFonts w:ascii="Times New Roman" w:hAnsi="Times New Roman" w:cs="Times New Roman"/>
-          <w:color w:val="EE0000"/>
-        </w:rPr>
-        <w:t>(если мы предусматриваем механизм обратной связи)</w:t>
-      </w:r>
-      <w:r>
-        <w:rPr>
-          <w:rFonts w:ascii="Times New Roman" w:hAnsi="Times New Roman" w:cs="Times New Roman"/>
-          <w:color w:val="EE0000"/>
-        </w:rPr>
-        <w:t>.</w:t>
+        </w:rPr>
+      </w:pPr>
+      <w:r>
+        <w:rPr>
+          <w:rFonts w:ascii="Times New Roman" w:hAnsi="Times New Roman" w:cs="Times New Roman"/>
+        </w:rPr>
+        <w:t>улучшения качества предоставляемых услуг и сервисов.</w:t>
       </w:r>
     </w:p>
     <w:p>
@@ -202,58 +179,7 @@
         <w:rPr>
           <w:rFonts w:ascii="Times New Roman" w:hAnsi="Times New Roman" w:cs="Times New Roman"/>
         </w:rPr>
-        <w:t>Перечень обрабатываемых персональных данных:</w:t>
-      </w:r>
-      <w:r>
-        <w:rPr>
-          <w:rFonts w:ascii="Times New Roman" w:hAnsi="Times New Roman" w:cs="Times New Roman"/>
-        </w:rPr>
-        <w:t xml:space="preserve"> фамилия,</w:t>
-      </w:r>
-      <w:r>
-        <w:rPr>
-          <w:rFonts w:ascii="Times New Roman" w:hAnsi="Times New Roman" w:cs="Times New Roman"/>
-        </w:rPr>
-        <w:t xml:space="preserve"> имя, электронные данные и идентификаторы, используемые для доступа к сайту Организации, включая IP-адрес, </w:t>
-      </w:r>
-      <w:r>
-        <w:rPr>
-          <w:rFonts w:ascii="Times New Roman" w:hAnsi="Times New Roman" w:cs="Times New Roman"/>
-          <w:color w:val="EE0000"/>
-          <w:u w:val="single"/>
-        </w:rPr>
-        <w:t xml:space="preserve">файлы </w:t>
-      </w:r>
-      <w:proofErr w:type="spellStart"/>
-      <w:r>
-        <w:rPr>
-          <w:rFonts w:ascii="Times New Roman" w:hAnsi="Times New Roman" w:cs="Times New Roman"/>
-          <w:color w:val="EE0000"/>
-          <w:u w:val="single"/>
-        </w:rPr>
-        <w:t>cookie</w:t>
-      </w:r>
-      <w:proofErr w:type="spellEnd"/>
-      <w:r>
-        <w:rPr>
-          <w:rFonts w:ascii="Times New Roman" w:hAnsi="Times New Roman" w:cs="Times New Roman"/>
-          <w:color w:val="EE0000"/>
-          <w:u w:val="single"/>
-        </w:rPr>
-        <w:t xml:space="preserve"> (?)</w:t>
-      </w:r>
-      <w:r>
-        <w:rPr>
-          <w:rFonts w:ascii="Times New Roman" w:hAnsi="Times New Roman" w:cs="Times New Roman"/>
-          <w:u w:val="single"/>
-        </w:rPr>
-        <w:t>,</w:t>
-      </w:r>
-      <w:r>
-        <w:rPr>
-          <w:rFonts w:ascii="Times New Roman" w:hAnsi="Times New Roman" w:cs="Times New Roman"/>
-        </w:rPr>
-        <w:t xml:space="preserve"> данные об идентификаторе браузера.</w:t>
+        <w:t>Перечень обрабатываемых персональных данных: фамилия, имя, адрес электронной почты, электронные данные и идентификаторы, используемые для доступа к сайту Организации, включая IP-адрес, данные об идентификаторе браузера, а также любые данные, которые субъект персональных данных самостоятельно вносит в поля конструктора договоров при создании и сохранении черновиков (драфтов). Организация осуществляет обработку персональных данных в соответствии с требованиями российского законодательства, в том числе путем обеспечения соответствующих организационных, правовых и технических мер.</w:t>
       </w:r>
     </w:p>
     <w:p>
@@ -266,7 +192,55 @@
         <w:rPr>
           <w:rFonts w:ascii="Times New Roman" w:hAnsi="Times New Roman" w:cs="Times New Roman"/>
         </w:rPr>
-        <w:t>Организация осуществляет обработку персональных данных в соответствии с требованиями российского законодательства, в том числе путем обеспечения соответствующих организационных, правовых и технических мер.</w:t>
+        <w:t xml:space="preserve">Настоящее согласие предоставляется с момента проставления отметки (галочки) </w:t>
+      </w:r>
+      <w:r>
+        <w:rPr>
+          <w:rFonts w:ascii="Times New Roman" w:hAnsi="Times New Roman" w:cs="Times New Roman"/>
+        </w:rPr>
+        <w:t xml:space="preserve">в чекбоксе </w:t>
+      </w:r>
+      <w:r>
+        <w:rPr>
+          <w:rFonts w:ascii="Times New Roman" w:hAnsi="Times New Roman" w:cs="Times New Roman"/>
+        </w:rPr>
+        <w:t>«Я даю согласие на обработку персональных данных»</w:t>
+      </w:r>
+      <w:r>
+        <w:rPr>
+          <w:rFonts w:ascii="Times New Roman" w:hAnsi="Times New Roman" w:cs="Times New Roman"/>
+        </w:rPr>
+        <w:t xml:space="preserve"> </w:t>
+      </w:r>
+      <w:r>
+        <w:rPr>
+          <w:rFonts w:ascii="Times New Roman" w:hAnsi="Times New Roman" w:cs="Times New Roman"/>
+        </w:rPr>
+        <w:t>и действительно в течение срока, необходимого для достижения целей обработки персональных данных.</w:t>
+      </w:r>
+      <w:r>
+        <w:rPr>
+          <w:rFonts w:ascii="Times New Roman" w:hAnsi="Times New Roman" w:cs="Times New Roman"/>
+        </w:rPr>
+        <w:t xml:space="preserve"> </w:t>
+      </w:r>
+      <w:r>
+        <w:rPr>
+          <w:rFonts w:ascii="Times New Roman" w:hAnsi="Times New Roman" w:cs="Times New Roman"/>
+        </w:rPr>
+        <w:t>В связи с использованием электронной формы предоставления данных, указание паспортных данных и адреса регистрации в тексте настоящего Согласия не требуется.</w:t>
+      </w:r>
+      <w:r>
+        <w:rPr>
+          <w:rFonts w:ascii="Times New Roman" w:hAnsi="Times New Roman" w:cs="Times New Roman"/>
+        </w:rPr>
+        <w:t xml:space="preserve"> </w:t>
+      </w:r>
+      <w:r>
+        <w:rPr>
+          <w:rFonts w:ascii="Times New Roman" w:hAnsi="Times New Roman" w:cs="Times New Roman"/>
+        </w:rPr>
+        <w:t>Организация хранит персональные данные в течение срока существования учетной записи, при этом сохраненные черновики (драфты) договоров хранятся до момента их удаления пользователем либо до момента прекращения действия учетной записи. После прекращения действия учетной записи данные уничтожаются в течение 30 дней, за исключением случаев, когда закон требует их дальнейшего хранения.</w:t>
       </w:r>
     </w:p>
     <w:p>
@@ -279,45 +253,68 @@
         <w:rPr>
           <w:rFonts w:ascii="Times New Roman" w:hAnsi="Times New Roman" w:cs="Times New Roman"/>
         </w:rPr>
-        <w:t>Субъект персональных данных предоставляет свои персональные данные добровольно и самостоятельно путем заполнения соответствующих полей веб-форм на сайте.</w:t>
+        <w:t xml:space="preserve">Субъект персональных данных вправе в любое время отозвать настоящее согласие без указания причин. Отзыв согласия может быть осуществлен </w:t>
+      </w:r>
+      <w:r>
+        <w:rPr>
+          <w:rFonts w:ascii="Times New Roman" w:hAnsi="Times New Roman" w:cs="Times New Roman"/>
+        </w:rPr>
+        <w:t>любым из указанных способов:</w:t>
       </w:r>
     </w:p>
     <w:p>
       <w:pPr>
-        <w:rPr>
-          <w:rFonts w:ascii="Times New Roman" w:hAnsi="Times New Roman" w:cs="Times New Roman"/>
-        </w:rPr>
-      </w:pPr>
-      <w:r>
-        <w:rPr>
-          <w:rFonts w:ascii="Times New Roman" w:hAnsi="Times New Roman" w:cs="Times New Roman"/>
-        </w:rPr>
-        <w:t xml:space="preserve">Согласие на обработку персональных данных считается предоставленным с момента совершения субъектом персональных данных активного действия </w:t>
-      </w:r>
-      <w:r>
-        <w:rPr>
-          <w:rFonts w:ascii="Times New Roman" w:hAnsi="Times New Roman" w:cs="Times New Roman"/>
-        </w:rPr>
-        <w:t>путем</w:t>
-      </w:r>
-      <w:r>
-        <w:rPr>
-          <w:rFonts w:ascii="Times New Roman" w:hAnsi="Times New Roman" w:cs="Times New Roman"/>
-        </w:rPr>
-        <w:t xml:space="preserve"> проставления отметки (галочки) в чекбоксе «Я даю согласие на обработку персональных данных».</w:t>
+        <w:pStyle w:val="a7"/>
+        <w:numPr>
+          <w:ilvl w:val="0"/>
+          <w:numId w:val="3"/>
+        </w:numPr>
+        <w:rPr>
+          <w:rFonts w:ascii="Times New Roman" w:hAnsi="Times New Roman" w:cs="Times New Roman"/>
+        </w:rPr>
+      </w:pPr>
+      <w:r>
+        <w:rPr>
+          <w:rFonts w:ascii="Times New Roman" w:hAnsi="Times New Roman" w:cs="Times New Roman"/>
+        </w:rPr>
+        <w:lastRenderedPageBreak/>
+        <w:t>п</w:t>
+      </w:r>
+      <w:r>
+        <w:rPr>
+          <w:rFonts w:ascii="Times New Roman" w:hAnsi="Times New Roman" w:cs="Times New Roman"/>
+        </w:rPr>
+        <w:t>утем нажатия кнопки «Отозвать согласие на обработку персональных данных» в разделе «Личный кабинет» на сайте «МоёПраво»</w:t>
+      </w:r>
+      <w:r>
+        <w:rPr>
+          <w:rFonts w:ascii="Times New Roman" w:hAnsi="Times New Roman" w:cs="Times New Roman"/>
+        </w:rPr>
+        <w:t>;</w:t>
       </w:r>
     </w:p>
     <w:p>
       <w:pPr>
-        <w:rPr>
-          <w:rFonts w:ascii="Times New Roman" w:hAnsi="Times New Roman" w:cs="Times New Roman"/>
-        </w:rPr>
-      </w:pPr>
-      <w:r>
-        <w:rPr>
-          <w:rFonts w:ascii="Times New Roman" w:hAnsi="Times New Roman" w:cs="Times New Roman"/>
-        </w:rPr>
-        <w:t>Указанные действия субъекта персональных данных подтверждают, что он ознакомлен с настоящим Согласием и Политикой конфиденциальности, а также осознанно и добровольно предоставляет свои данные. В связи с использованием электронной формы предоставления данных, указание паспортных данных и адреса регистрации в тексте настоящего Согласия не требуется</w:t>
+        <w:pStyle w:val="a7"/>
+        <w:numPr>
+          <w:ilvl w:val="0"/>
+          <w:numId w:val="3"/>
+        </w:numPr>
+        <w:rPr>
+          <w:rFonts w:ascii="Times New Roman" w:hAnsi="Times New Roman" w:cs="Times New Roman"/>
+        </w:rPr>
+      </w:pPr>
+      <w:r>
+        <w:rPr>
+          <w:rFonts w:ascii="Times New Roman" w:hAnsi="Times New Roman" w:cs="Times New Roman"/>
+        </w:rPr>
+        <w:t>заказным письмом по почтовому адресу Оператора</w:t>
+      </w:r>
+      <w:r>
+        <w:rPr>
+          <w:rFonts w:ascii="Times New Roman" w:hAnsi="Times New Roman" w:cs="Times New Roman"/>
+        </w:rPr>
+        <w:t>.</w:t>
       </w:r>
     </w:p>
     <w:p>
@@ -326,105 +323,36 @@
           <w:rFonts w:ascii="Times New Roman" w:hAnsi="Times New Roman" w:cs="Times New Roman"/>
         </w:rPr>
       </w:pPr>
-      <w:r>
-        <w:rPr>
-          <w:rFonts w:ascii="Times New Roman" w:hAnsi="Times New Roman" w:cs="Times New Roman"/>
-        </w:rPr>
-        <w:t xml:space="preserve">Настоящее согласие на обработку персональных данных предоставляется с момента его </w:t>
-      </w:r>
-      <w:r>
-        <w:rPr>
-          <w:rFonts w:ascii="Times New Roman" w:hAnsi="Times New Roman" w:cs="Times New Roman"/>
-        </w:rPr>
-        <w:t>предоставления</w:t>
-      </w:r>
-      <w:r>
-        <w:rPr>
-          <w:rFonts w:ascii="Times New Roman" w:hAnsi="Times New Roman" w:cs="Times New Roman"/>
-        </w:rPr>
-        <w:t xml:space="preserve"> и действительно в течение срока, необходимого для достижения целей обработки персональных данных. Организация хранит персональные данные в течение срока существования учетной записи, а после их прекращения уничтожаются в течение 30 дней, за исключением случаев, когда закон требует их дальнейшего хранения.</w:t>
-      </w:r>
     </w:p>
     <w:p>
       <w:pPr>
         <w:rPr>
           <w:rFonts w:ascii="Times New Roman" w:hAnsi="Times New Roman" w:cs="Times New Roman"/>
-          <w:color w:val="EE0000"/>
-        </w:rPr>
-      </w:pPr>
-      <w:r>
-        <w:rPr>
-          <w:rFonts w:ascii="Times New Roman" w:hAnsi="Times New Roman" w:cs="Times New Roman"/>
-        </w:rPr>
-        <w:lastRenderedPageBreak/>
-        <w:t xml:space="preserve">Субъект персональных данных вправе в любое время отозвать настоящее согласие без указания причин. </w:t>
-      </w:r>
-      <w:r>
-        <w:rPr>
-          <w:rFonts w:ascii="Times New Roman" w:hAnsi="Times New Roman" w:cs="Times New Roman"/>
-        </w:rPr>
-        <w:t xml:space="preserve">Настоящее согласие на обработку персональных данных может быть отозвано путем направления письменного обращения на адрес электронной почты: </w:t>
-      </w:r>
-      <w:proofErr w:type="spellStart"/>
-      <w:r>
-        <w:rPr>
-          <w:rFonts w:ascii="Times New Roman" w:hAnsi="Times New Roman" w:cs="Times New Roman"/>
-          <w:color w:val="5B9BD5" w:themeColor="accent5"/>
-        </w:rPr>
-        <w:t>support</w:t>
-      </w:r>
-      <w:proofErr w:type="spellEnd"/>
-      <w:r>
-        <w:rPr>
-          <w:rFonts w:ascii="Times New Roman" w:hAnsi="Times New Roman" w:cs="Times New Roman"/>
-          <w:color w:val="5B9BD5" w:themeColor="accent5"/>
-        </w:rPr>
-        <w:t>_</w:t>
-      </w:r>
-      <w:proofErr w:type="spellStart"/>
-      <w:r>
-        <w:rPr>
-          <w:rFonts w:ascii="Times New Roman" w:hAnsi="Times New Roman" w:cs="Times New Roman"/>
-          <w:color w:val="5B9BD5" w:themeColor="accent5"/>
-          <w:lang w:val="en-US"/>
-        </w:rPr>
-        <w:t>moepravo</w:t>
-      </w:r>
-      <w:proofErr w:type="spellEnd"/>
-      <w:r>
-        <w:rPr>
-          <w:rFonts w:ascii="Times New Roman" w:hAnsi="Times New Roman" w:cs="Times New Roman"/>
-          <w:color w:val="5B9BD5" w:themeColor="accent5"/>
-        </w:rPr>
-        <w:t xml:space="preserve">@yandex.ru. </w:t>
-      </w:r>
-      <w:r>
-        <w:rPr>
-          <w:rFonts w:ascii="Times New Roman" w:hAnsi="Times New Roman" w:cs="Times New Roman"/>
-          <w:color w:val="EE0000"/>
-        </w:rPr>
-        <w:t>(это если у нас есть поддержка</w:t>
-      </w:r>
-      <w:r>
-        <w:rPr>
-          <w:rFonts w:ascii="Times New Roman" w:hAnsi="Times New Roman" w:cs="Times New Roman"/>
-          <w:color w:val="EE0000"/>
-        </w:rPr>
-        <w:t xml:space="preserve"> или отдельный почтовый адрес для отзыва согласия</w:t>
-      </w:r>
-      <w:r>
-        <w:rPr>
-          <w:rFonts w:ascii="Times New Roman" w:hAnsi="Times New Roman" w:cs="Times New Roman"/>
-          <w:color w:val="EE0000"/>
-        </w:rPr>
-        <w:t>)</w:t>
-      </w:r>
-      <w:r>
-        <w:rPr>
-          <w:rFonts w:ascii="Times New Roman" w:hAnsi="Times New Roman" w:cs="Times New Roman"/>
-          <w:color w:val="EE0000"/>
-        </w:rPr>
-        <w:t>.</w:t>
+        </w:rPr>
+      </w:pPr>
+      <w:r>
+        <w:rPr>
+          <w:rFonts w:ascii="Times New Roman" w:hAnsi="Times New Roman" w:cs="Times New Roman"/>
+          <w:i/>
+          <w:iCs/>
+        </w:rPr>
+        <w:t>Дата публикации документа:</w:t>
+      </w:r>
+      <w:r>
+        <w:rPr>
+          <w:rFonts w:ascii="Times New Roman" w:hAnsi="Times New Roman" w:cs="Times New Roman"/>
+          <w:i/>
+          <w:iCs/>
+        </w:rPr>
+        <w:t xml:space="preserve"> 25</w:t>
+      </w:r>
+      <w:r>
+        <w:rPr>
+          <w:rFonts w:ascii="Times New Roman" w:hAnsi="Times New Roman" w:cs="Times New Roman"/>
+          <w:i/>
+          <w:iCs/>
+        </w:rPr>
+        <w:t>.10.2026</w:t>
       </w:r>
     </w:p>
     <w:p>
@@ -433,64 +361,7 @@
           <w:rFonts w:ascii="Times New Roman" w:hAnsi="Times New Roman" w:cs="Times New Roman"/>
         </w:rPr>
       </w:pPr>
-      <w:r>
-        <w:rPr>
-          <w:rFonts w:ascii="Times New Roman" w:hAnsi="Times New Roman" w:cs="Times New Roman"/>
-        </w:rPr>
-        <w:t>Или:</w:t>
-      </w:r>
     </w:p>
-    <w:p>
-      <w:pPr>
-        <w:rPr>
-          <w:rFonts w:ascii="Times New Roman" w:hAnsi="Times New Roman" w:cs="Times New Roman"/>
-        </w:rPr>
-      </w:pPr>
-      <w:r>
-        <w:rPr>
-          <w:rFonts w:ascii="Times New Roman" w:hAnsi="Times New Roman" w:cs="Times New Roman"/>
-        </w:rPr>
-        <w:t>Субъект персональных данных вправе в любое время отозвать настоящее согласие без указания причин. Настоящее согласие на обработку персональных данных может быть отозвано путем путём нажатия кнопки «Отозвать согласие на обработку персональных данных» в разделе «Личный кабинет» на сайте «</w:t>
-      </w:r>
-      <w:proofErr w:type="spellStart"/>
-      <w:r>
-        <w:rPr>
-          <w:rFonts w:ascii="Times New Roman" w:hAnsi="Times New Roman" w:cs="Times New Roman"/>
-        </w:rPr>
-        <w:t>МоёПраво</w:t>
-      </w:r>
-      <w:proofErr w:type="spellEnd"/>
-      <w:r>
-        <w:rPr>
-          <w:rFonts w:ascii="Times New Roman" w:hAnsi="Times New Roman" w:cs="Times New Roman"/>
-        </w:rPr>
-        <w:t>».</w:t>
-      </w:r>
-    </w:p>
-    <w:p>
-      <w:pPr>
-        <w:rPr>
-          <w:rFonts w:ascii="Times New Roman" w:hAnsi="Times New Roman" w:cs="Times New Roman"/>
-          <w:color w:val="5B9BD5" w:themeColor="accent5"/>
-        </w:rPr>
-      </w:pPr>
-    </w:p>
-    <w:p>
-      <w:pPr>
-        <w:rPr>
-          <w:rFonts w:ascii="Times New Roman" w:hAnsi="Times New Roman" w:cs="Times New Roman"/>
-        </w:rPr>
-      </w:pPr>
-      <w:r>
-        <w:rPr>
-          <w:rFonts w:ascii="Times New Roman" w:hAnsi="Times New Roman" w:cs="Times New Roman"/>
-          <w:i/>
-          <w:iCs/>
-        </w:rPr>
-        <w:t>Дата публикации документа: 23.10.2026</w:t>
-      </w:r>
-    </w:p>
-    <w:p/>
     <w:sectPr>
       <w:pgSz w:w="11906" w:h="16838"/>
       <w:pgMar w:top="1134" w:right="850" w:bottom="1134" w:left="1701" w:header="708" w:footer="708" w:gutter="0"/>
@@ -504,9 +375,9 @@
 <file path=word/numbering.xml><?xml version="1.0" encoding="utf-8"?>
 <w:numbering xmlns:wpc="http://schemas.microsoft.com/office/word/2010/wordprocessingCanvas" xmlns:cx="http://schemas.microsoft.com/office/drawing/2014/chartex" xmlns:cx1="http://schemas.microsoft.com/office/drawing/2015/9/8/chartex" xmlns:cx2="http://schemas.microsoft.com/office/drawing/2015/10/21/chartex" xmlns:cx3="http://schemas.microsoft.com/office/drawing/2016/5/9/chartex" xmlns:cx4="http://schemas.microsoft.com/office/drawing/2016/5/10/chartex" xmlns:cx5="http://schemas.microsoft.com/office/drawing/2016/5/11/chartex" xmlns:cx6="http://schemas.microsoft.com/office/drawing/2016/5/12/chartex" xmlns:cx7="http://schemas.microsoft.com/office/drawing/2016/5/13/chartex" xmlns:cx8="http://schemas.microsoft.com/office/drawing/2016/5/14/chartex" xmlns:mc="http://schemas.openxmlformats.org/markup-compatibility/2006" xmlns:aink="http://schemas.microsoft.com/office/drawing/2016/ink" xmlns:am3d="http://schemas.microsoft.com/office/drawing/2017/model3d" xmlns:o="urn:schemas-microsoft-com:office:office" xmlns:oel="http://schemas.microsoft.com/office/2019/extlst" xmlns:r="http://schemas.openxmlformats.org/officeDocument/2006/relationships" xmlns:m="http://schemas.openxmlformats.org/officeDocument/2006/math" xmlns:v="urn:schemas-microsoft-com:vml" xmlns:wp14="http://schemas.microsoft.com/office/word/2010/wordprocessingDrawing" xmlns:wp="http://schemas.openxmlformats.org/drawingml/2006/wordprocessingDrawing" xmlns:w10="urn:schemas-microsoft-com:office:word" xmlns:w="http://schemas.openxmlformats.org/wordprocessingml/2006/main" xmlns:w14="http://schemas.microsoft.com/office/word/2010/wordml" xmlns:w15="http://schemas.microsoft.com/office/word/2012/wordml" xmlns:w16cex="http://schemas.microsoft.com/office/word/2018/wordml/cex" xmlns:w16cid="http://schemas.microsoft.com/office/word/2016/wordml/cid" xmlns:w16="http://schemas.microsoft.com/office/word/2018/wordml" xmlns:w16du="http://schemas.microsoft.com/office/word/2023/wordml/word16du" xmlns:w16sdtdh="http://schemas.microsoft.com/office/word/2020/wordml/sdtdatahash" xmlns:w16sdtfl="http://schemas.microsoft.com/office/word/2024/wordml/sdtformatlock" xmlns:w16se="http://schemas.microsoft.com/office/word/2015/wordml/symex" xmlns:wpg="http://schemas.microsoft.com/office/word/2010/wordprocessingGroup" xmlns:wpi="http://schemas.microsoft.com/office/word/2010/wordprocessingInk" xmlns:wne="http://schemas.microsoft.com/office/word/2006/wordml" xmlns:wps="http://schemas.microsoft.com/office/word/2010/wordprocessingShape" mc:Ignorable="w14 w15 w16se w16cid w16 w16cex w16sdtdh w16sdtfl w16du wp14">
   <w:abstractNum w:abstractNumId="0" w15:restartNumberingAfterBreak="0">
-    <w:nsid w:val="0D4C52C9"/>
+    <w:nsid w:val="0E7D717C"/>
     <w:multiLevelType w:val="multilevel"/>
-    <w:tmpl w:val="6EDAFCF2"/>
+    <w:tmpl w:val="D9147B66"/>
     <w:lvl w:ilvl="0">
       <w:start w:val="1"/>
       <w:numFmt w:val="bullet"/>
@@ -653,13 +524,13 @@
     </w:lvl>
   </w:abstractNum>
   <w:abstractNum w:abstractNumId="1" w15:restartNumberingAfterBreak="0">
-    <w:nsid w:val="498D6889"/>
+    <w:nsid w:val="162D5FFB"/>
     <w:multiLevelType w:val="multilevel"/>
-    <w:tmpl w:val="54CC9AB8"/>
+    <w:tmpl w:val="D3948808"/>
     <w:lvl w:ilvl="0">
       <w:start w:val="1"/>
-      <w:numFmt w:val="bullet"/>
-      <w:lvlText w:val=""/>
+      <w:numFmt w:val="decimal"/>
+      <w:lvlText w:val="%1."/>
       <w:lvlJc w:val="left"/>
       <w:pPr>
         <w:tabs>
@@ -667,15 +538,11 @@
         </w:tabs>
         <w:ind w:left="720" w:hanging="360"/>
       </w:pPr>
-      <w:rPr>
-        <w:rFonts w:ascii="Symbol" w:hAnsi="Symbol" w:hint="default"/>
-        <w:sz w:val="20"/>
-      </w:rPr>
     </w:lvl>
     <w:lvl w:ilvl="1" w:tentative="1">
       <w:start w:val="1"/>
-      <w:numFmt w:val="bullet"/>
-      <w:lvlText w:val="o"/>
+      <w:numFmt w:val="decimal"/>
+      <w:lvlText w:val="%2."/>
       <w:lvlJc w:val="left"/>
       <w:pPr>
         <w:tabs>
@@ -683,15 +550,11 @@
         </w:tabs>
         <w:ind w:left="1440" w:hanging="360"/>
       </w:pPr>
-      <w:rPr>
-        <w:rFonts w:ascii="Courier New" w:hAnsi="Courier New" w:hint="default"/>
-        <w:sz w:val="20"/>
-      </w:rPr>
     </w:lvl>
     <w:lvl w:ilvl="2" w:tentative="1">
       <w:start w:val="1"/>
-      <w:numFmt w:val="bullet"/>
-      <w:lvlText w:val=""/>
+      <w:numFmt w:val="decimal"/>
+      <w:lvlText w:val="%3."/>
       <w:lvlJc w:val="left"/>
       <w:pPr>
         <w:tabs>
@@ -699,15 +562,11 @@
         </w:tabs>
         <w:ind w:left="2160" w:hanging="360"/>
       </w:pPr>
-      <w:rPr>
-        <w:rFonts w:ascii="Wingdings" w:hAnsi="Wingdings" w:hint="default"/>
-        <w:sz w:val="20"/>
-      </w:rPr>
     </w:lvl>
     <w:lvl w:ilvl="3" w:tentative="1">
       <w:start w:val="1"/>
-      <w:numFmt w:val="bullet"/>
-      <w:lvlText w:val=""/>
+      <w:numFmt w:val="decimal"/>
+      <w:lvlText w:val="%4."/>
       <w:lvlJc w:val="left"/>
       <w:pPr>
         <w:tabs>
@@ -715,15 +574,11 @@
         </w:tabs>
         <w:ind w:left="2880" w:hanging="360"/>
       </w:pPr>
-      <w:rPr>
-        <w:rFonts w:ascii="Wingdings" w:hAnsi="Wingdings" w:hint="default"/>
-        <w:sz w:val="20"/>
-      </w:rPr>
     </w:lvl>
     <w:lvl w:ilvl="4" w:tentative="1">
       <w:start w:val="1"/>
-      <w:numFmt w:val="bullet"/>
-      <w:lvlText w:val=""/>
+      <w:numFmt w:val="decimal"/>
+      <w:lvlText w:val="%5."/>
       <w:lvlJc w:val="left"/>
       <w:pPr>
         <w:tabs>
@@ -731,15 +586,11 @@
         </w:tabs>
         <w:ind w:left="3600" w:hanging="360"/>
       </w:pPr>
-      <w:rPr>
-        <w:rFonts w:ascii="Wingdings" w:hAnsi="Wingdings" w:hint="default"/>
-        <w:sz w:val="20"/>
-      </w:rPr>
     </w:lvl>
     <w:lvl w:ilvl="5" w:tentative="1">
       <w:start w:val="1"/>
-      <w:numFmt w:val="bullet"/>
-      <w:lvlText w:val=""/>
+      <w:numFmt w:val="decimal"/>
+      <w:lvlText w:val="%6."/>
       <w:lvlJc w:val="left"/>
       <w:pPr>
         <w:tabs>
@@ -747,15 +598,11 @@
         </w:tabs>
         <w:ind w:left="4320" w:hanging="360"/>
       </w:pPr>
-      <w:rPr>
-        <w:rFonts w:ascii="Wingdings" w:hAnsi="Wingdings" w:hint="default"/>
-        <w:sz w:val="20"/>
-      </w:rPr>
     </w:lvl>
     <w:lvl w:ilvl="6" w:tentative="1">
       <w:start w:val="1"/>
-      <w:numFmt w:val="bullet"/>
-      <w:lvlText w:val=""/>
+      <w:numFmt w:val="decimal"/>
+      <w:lvlText w:val="%7."/>
       <w:lvlJc w:val="left"/>
       <w:pPr>
         <w:tabs>
@@ -763,15 +610,11 @@
         </w:tabs>
         <w:ind w:left="5040" w:hanging="360"/>
       </w:pPr>
-      <w:rPr>
-        <w:rFonts w:ascii="Wingdings" w:hAnsi="Wingdings" w:hint="default"/>
-        <w:sz w:val="20"/>
-      </w:rPr>
     </w:lvl>
     <w:lvl w:ilvl="7" w:tentative="1">
       <w:start w:val="1"/>
-      <w:numFmt w:val="bullet"/>
-      <w:lvlText w:val=""/>
+      <w:numFmt w:val="decimal"/>
+      <w:lvlText w:val="%8."/>
       <w:lvlJc w:val="left"/>
       <w:pPr>
         <w:tabs>
@@ -779,15 +622,11 @@
         </w:tabs>
         <w:ind w:left="5760" w:hanging="360"/>
       </w:pPr>
-      <w:rPr>
-        <w:rFonts w:ascii="Wingdings" w:hAnsi="Wingdings" w:hint="default"/>
-        <w:sz w:val="20"/>
-      </w:rPr>
     </w:lvl>
     <w:lvl w:ilvl="8" w:tentative="1">
       <w:start w:val="1"/>
-      <w:numFmt w:val="bullet"/>
-      <w:lvlText w:val=""/>
+      <w:numFmt w:val="decimal"/>
+      <w:lvlText w:val="%9."/>
       <w:lvlJc w:val="left"/>
       <w:pPr>
         <w:tabs>
@@ -795,17 +634,129 @@
         </w:tabs>
         <w:ind w:left="6480" w:hanging="360"/>
       </w:pPr>
+    </w:lvl>
+  </w:abstractNum>
+  <w:abstractNum w:abstractNumId="2" w15:restartNumberingAfterBreak="0">
+    <w:nsid w:val="563A3FB4"/>
+    <w:multiLevelType w:val="hybridMultilevel"/>
+    <w:tmpl w:val="5BECD72A"/>
+    <w:lvl w:ilvl="0" w:tplc="04190001">
+      <w:start w:val="1"/>
+      <w:numFmt w:val="bullet"/>
+      <w:lvlText w:val=""/>
+      <w:lvlJc w:val="left"/>
+      <w:pPr>
+        <w:ind w:left="720" w:hanging="360"/>
+      </w:pPr>
+      <w:rPr>
+        <w:rFonts w:ascii="Symbol" w:hAnsi="Symbol" w:hint="default"/>
+      </w:rPr>
+    </w:lvl>
+    <w:lvl w:ilvl="1" w:tplc="04190003" w:tentative="1">
+      <w:start w:val="1"/>
+      <w:numFmt w:val="bullet"/>
+      <w:lvlText w:val="o"/>
+      <w:lvlJc w:val="left"/>
+      <w:pPr>
+        <w:ind w:left="1440" w:hanging="360"/>
+      </w:pPr>
+      <w:rPr>
+        <w:rFonts w:ascii="Courier New" w:hAnsi="Courier New" w:cs="Courier New" w:hint="default"/>
+      </w:rPr>
+    </w:lvl>
+    <w:lvl w:ilvl="2" w:tplc="04190005" w:tentative="1">
+      <w:start w:val="1"/>
+      <w:numFmt w:val="bullet"/>
+      <w:lvlText w:val=""/>
+      <w:lvlJc w:val="left"/>
+      <w:pPr>
+        <w:ind w:left="2160" w:hanging="360"/>
+      </w:pPr>
       <w:rPr>
         <w:rFonts w:ascii="Wingdings" w:hAnsi="Wingdings" w:hint="default"/>
-        <w:sz w:val="20"/>
       </w:rPr>
     </w:lvl>
+    <w:lvl w:ilvl="3" w:tplc="04190001" w:tentative="1">
+      <w:start w:val="1"/>
+      <w:numFmt w:val="bullet"/>
+      <w:lvlText w:val=""/>
+      <w:lvlJc w:val="left"/>
+      <w:pPr>
+        <w:ind w:left="2880" w:hanging="360"/>
+      </w:pPr>
+      <w:rPr>
+        <w:rFonts w:ascii="Symbol" w:hAnsi="Symbol" w:hint="default"/>
+      </w:rPr>
+    </w:lvl>
+    <w:lvl w:ilvl="4" w:tplc="04190003" w:tentative="1">
+      <w:start w:val="1"/>
+      <w:numFmt w:val="bullet"/>
+      <w:lvlText w:val="o"/>
+      <w:lvlJc w:val="left"/>
+      <w:pPr>
+        <w:ind w:left="3600" w:hanging="360"/>
+      </w:pPr>
+      <w:rPr>
+        <w:rFonts w:ascii="Courier New" w:hAnsi="Courier New" w:cs="Courier New" w:hint="default"/>
+      </w:rPr>
+    </w:lvl>
+    <w:lvl w:ilvl="5" w:tplc="04190005" w:tentative="1">
+      <w:start w:val="1"/>
+      <w:numFmt w:val="bullet"/>
+      <w:lvlText w:val=""/>
+      <w:lvlJc w:val="left"/>
+      <w:pPr>
+        <w:ind w:left="4320" w:hanging="360"/>
+      </w:pPr>
+      <w:rPr>
+        <w:rFonts w:ascii="Wingdings" w:hAnsi="Wingdings" w:hint="default"/>
+      </w:rPr>
+    </w:lvl>
+    <w:lvl w:ilvl="6" w:tplc="04190001" w:tentative="1">
+      <w:start w:val="1"/>
+      <w:numFmt w:val="bullet"/>
+      <w:lvlText w:val=""/>
+      <w:lvlJc w:val="left"/>
+      <w:pPr>
+        <w:ind w:left="5040" w:hanging="360"/>
+      </w:pPr>
+      <w:rPr>
+        <w:rFonts w:ascii="Symbol" w:hAnsi="Symbol" w:hint="default"/>
+      </w:rPr>
+    </w:lvl>
+    <w:lvl w:ilvl="7" w:tplc="04190003" w:tentative="1">
+      <w:start w:val="1"/>
+      <w:numFmt w:val="bullet"/>
+      <w:lvlText w:val="o"/>
+      <w:lvlJc w:val="left"/>
+      <w:pPr>
+        <w:ind w:left="5760" w:hanging="360"/>
+      </w:pPr>
+      <w:rPr>
+        <w:rFonts w:ascii="Courier New" w:hAnsi="Courier New" w:cs="Courier New" w:hint="default"/>
+      </w:rPr>
+    </w:lvl>
+    <w:lvl w:ilvl="8" w:tplc="04190005" w:tentative="1">
+      <w:start w:val="1"/>
+      <w:numFmt w:val="bullet"/>
+      <w:lvlText w:val=""/>
+      <w:lvlJc w:val="left"/>
+      <w:pPr>
+        <w:ind w:left="6480" w:hanging="360"/>
+      </w:pPr>
+      <w:rPr>
+        <w:rFonts w:ascii="Wingdings" w:hAnsi="Wingdings" w:hint="default"/>
+      </w:rPr>
+    </w:lvl>
   </w:abstractNum>
-  <w:num w:numId="1" w16cid:durableId="335810750">
+  <w:num w:numId="1" w16cid:durableId="777992275">
+    <w:abstractNumId w:val="0"/>
+  </w:num>
+  <w:num w:numId="2" w16cid:durableId="14500303">
     <w:abstractNumId w:val="1"/>
   </w:num>
-  <w:num w:numId="2" w16cid:durableId="842284222">
-    <w:abstractNumId w:val="0"/>
+  <w:num w:numId="3" w16cid:durableId="354579208">
+    <w:abstractNumId w:val="2"/>
   </w:num>
 </w:numbering>
 </file>
@@ -1218,7 +1169,7 @@
     <w:link w:val="10"/>
     <w:uiPriority w:val="9"/>
     <w:qFormat/>
-    <w:rsid w:val="00E9342F"/>
+    <w:rsid w:val="004565A2"/>
     <w:pPr>
       <w:keepNext/>
       <w:keepLines/>
@@ -1241,7 +1192,7 @@
     <w:semiHidden/>
     <w:unhideWhenUsed/>
     <w:qFormat/>
-    <w:rsid w:val="00E9342F"/>
+    <w:rsid w:val="004565A2"/>
     <w:pPr>
       <w:keepNext/>
       <w:keepLines/>
@@ -1264,7 +1215,7 @@
     <w:semiHidden/>
     <w:unhideWhenUsed/>
     <w:qFormat/>
-    <w:rsid w:val="00E9342F"/>
+    <w:rsid w:val="004565A2"/>
     <w:pPr>
       <w:keepNext/>
       <w:keepLines/>
@@ -1287,7 +1238,7 @@
     <w:semiHidden/>
     <w:unhideWhenUsed/>
     <w:qFormat/>
-    <w:rsid w:val="00E9342F"/>
+    <w:rsid w:val="004565A2"/>
     <w:pPr>
       <w:keepNext/>
       <w:keepLines/>
@@ -1310,7 +1261,7 @@
     <w:semiHidden/>
     <w:unhideWhenUsed/>
     <w:qFormat/>
-    <w:rsid w:val="00E9342F"/>
+    <w:rsid w:val="004565A2"/>
     <w:pPr>
       <w:keepNext/>
       <w:keepLines/>
@@ -1331,7 +1282,7 @@
     <w:semiHidden/>
     <w:unhideWhenUsed/>
     <w:qFormat/>
-    <w:rsid w:val="00E9342F"/>
+    <w:rsid w:val="004565A2"/>
     <w:pPr>
       <w:keepNext/>
       <w:keepLines/>
@@ -1354,7 +1305,7 @@
     <w:semiHidden/>
     <w:unhideWhenUsed/>
     <w:qFormat/>
-    <w:rsid w:val="00E9342F"/>
+    <w:rsid w:val="004565A2"/>
     <w:pPr>
       <w:keepNext/>
       <w:keepLines/>
@@ -1375,7 +1326,7 @@
     <w:semiHidden/>
     <w:unhideWhenUsed/>
     <w:qFormat/>
-    <w:rsid w:val="00E9342F"/>
+    <w:rsid w:val="004565A2"/>
     <w:pPr>
       <w:keepNext/>
       <w:keepLines/>
@@ -1398,7 +1349,7 @@
     <w:semiHidden/>
     <w:unhideWhenUsed/>
     <w:qFormat/>
-    <w:rsid w:val="00E9342F"/>
+    <w:rsid w:val="004565A2"/>
     <w:pPr>
       <w:keepNext/>
       <w:keepLines/>
@@ -1441,7 +1392,7 @@
     <w:basedOn w:val="a0"/>
     <w:link w:val="1"/>
     <w:uiPriority w:val="9"/>
-    <w:rsid w:val="00E9342F"/>
+    <w:rsid w:val="004565A2"/>
     <w:rPr>
       <w:rFonts w:asciiTheme="majorHAnsi" w:eastAsiaTheme="majorEastAsia" w:hAnsiTheme="majorHAnsi" w:cstheme="majorBidi"/>
       <w:color w:val="2F5496" w:themeColor="accent1" w:themeShade="BF"/>
@@ -1455,7 +1406,7 @@
     <w:link w:val="2"/>
     <w:uiPriority w:val="9"/>
     <w:semiHidden/>
-    <w:rsid w:val="00E9342F"/>
+    <w:rsid w:val="004565A2"/>
     <w:rPr>
       <w:rFonts w:asciiTheme="majorHAnsi" w:eastAsiaTheme="majorEastAsia" w:hAnsiTheme="majorHAnsi" w:cstheme="majorBidi"/>
       <w:color w:val="2F5496" w:themeColor="accent1" w:themeShade="BF"/>
@@ -1469,7 +1420,7 @@
     <w:link w:val="3"/>
     <w:uiPriority w:val="9"/>
     <w:semiHidden/>
-    <w:rsid w:val="00E9342F"/>
+    <w:rsid w:val="004565A2"/>
     <w:rPr>
       <w:rFonts w:eastAsiaTheme="majorEastAsia" w:cstheme="majorBidi"/>
       <w:color w:val="2F5496" w:themeColor="accent1" w:themeShade="BF"/>
@@ -1483,7 +1434,7 @@
     <w:link w:val="4"/>
     <w:uiPriority w:val="9"/>
     <w:semiHidden/>
-    <w:rsid w:val="00E9342F"/>
+    <w:rsid w:val="004565A2"/>
     <w:rPr>
       <w:rFonts w:eastAsiaTheme="majorEastAsia" w:cstheme="majorBidi"/>
       <w:i/>
@@ -1497,7 +1448,7 @@
     <w:link w:val="5"/>
     <w:uiPriority w:val="9"/>
     <w:semiHidden/>
-    <w:rsid w:val="00E9342F"/>
+    <w:rsid w:val="004565A2"/>
     <w:rPr>
       <w:rFonts w:eastAsiaTheme="majorEastAsia" w:cstheme="majorBidi"/>
       <w:color w:val="2F5496" w:themeColor="accent1" w:themeShade="BF"/>
@@ -1509,7 +1460,7 @@
     <w:link w:val="6"/>
     <w:uiPriority w:val="9"/>
     <w:semiHidden/>
-    <w:rsid w:val="00E9342F"/>
+    <w:rsid w:val="004565A2"/>
     <w:rPr>
       <w:rFonts w:eastAsiaTheme="majorEastAsia" w:cstheme="majorBidi"/>
       <w:i/>
@@ -1523,7 +1474,7 @@
     <w:link w:val="7"/>
     <w:uiPriority w:val="9"/>
     <w:semiHidden/>
-    <w:rsid w:val="00E9342F"/>
+    <w:rsid w:val="004565A2"/>
     <w:rPr>
       <w:rFonts w:eastAsiaTheme="majorEastAsia" w:cstheme="majorBidi"/>
       <w:color w:val="595959" w:themeColor="text1" w:themeTint="A6"/>
@@ -1535,7 +1486,7 @@
     <w:link w:val="8"/>
     <w:uiPriority w:val="9"/>
     <w:semiHidden/>
-    <w:rsid w:val="00E9342F"/>
+    <w:rsid w:val="004565A2"/>
     <w:rPr>
       <w:rFonts w:eastAsiaTheme="majorEastAsia" w:cstheme="majorBidi"/>
       <w:i/>
@@ -1549,7 +1500,7 @@
     <w:link w:val="9"/>
     <w:uiPriority w:val="9"/>
     <w:semiHidden/>
-    <w:rsid w:val="00E9342F"/>
+    <w:rsid w:val="004565A2"/>
     <w:rPr>
       <w:rFonts w:eastAsiaTheme="majorEastAsia" w:cstheme="majorBidi"/>
       <w:color w:val="272727" w:themeColor="text1" w:themeTint="D8"/>
@@ -1562,7 +1513,7 @@
     <w:link w:val="a4"/>
     <w:uiPriority w:val="10"/>
     <w:qFormat/>
-    <w:rsid w:val="00E9342F"/>
+    <w:rsid w:val="004565A2"/>
     <w:pPr>
       <w:spacing w:after="80" w:line="240" w:lineRule="auto"/>
       <w:contextualSpacing/>
@@ -1580,7 +1531,7 @@
     <w:basedOn w:val="a0"/>
     <w:link w:val="a3"/>
     <w:uiPriority w:val="10"/>
-    <w:rsid w:val="00E9342F"/>
+    <w:rsid w:val="004565A2"/>
     <w:rPr>
       <w:rFonts w:asciiTheme="majorHAnsi" w:eastAsiaTheme="majorEastAsia" w:hAnsiTheme="majorHAnsi" w:cstheme="majorBidi"/>
       <w:spacing w:val="-10"/>
@@ -1596,7 +1547,7 @@
     <w:link w:val="a6"/>
     <w:uiPriority w:val="11"/>
     <w:qFormat/>
-    <w:rsid w:val="00E9342F"/>
+    <w:rsid w:val="004565A2"/>
     <w:pPr>
       <w:numPr>
         <w:ilvl w:val="1"/>
@@ -1615,7 +1566,7 @@
     <w:basedOn w:val="a0"/>
     <w:link w:val="a5"/>
     <w:uiPriority w:val="11"/>
-    <w:rsid w:val="00E9342F"/>
+    <w:rsid w:val="004565A2"/>
     <w:rPr>
       <w:rFonts w:eastAsiaTheme="majorEastAsia" w:cstheme="majorBidi"/>
       <w:color w:val="595959" w:themeColor="text1" w:themeTint="A6"/>
@@ -1631,7 +1582,7 @@
     <w:link w:val="22"/>
     <w:uiPriority w:val="29"/>
     <w:qFormat/>
-    <w:rsid w:val="00E9342F"/>
+    <w:rsid w:val="004565A2"/>
     <w:pPr>
       <w:spacing w:before="160"/>
       <w:jc w:val="center"/>
@@ -1647,7 +1598,7 @@
     <w:basedOn w:val="a0"/>
     <w:link w:val="21"/>
     <w:uiPriority w:val="29"/>
-    <w:rsid w:val="00E9342F"/>
+    <w:rsid w:val="004565A2"/>
     <w:rPr>
       <w:i/>
       <w:iCs/>
@@ -1659,7 +1610,7 @@
     <w:basedOn w:val="a"/>
     <w:uiPriority w:val="34"/>
     <w:qFormat/>
-    <w:rsid w:val="00E9342F"/>
+    <w:rsid w:val="004565A2"/>
     <w:pPr>
       <w:ind w:left="720"/>
       <w:contextualSpacing/>
@@ -1670,7 +1621,7 @@
     <w:basedOn w:val="a0"/>
     <w:uiPriority w:val="21"/>
     <w:qFormat/>
-    <w:rsid w:val="00E9342F"/>
+    <w:rsid w:val="004565A2"/>
     <w:rPr>
       <w:i/>
       <w:iCs/>
@@ -1684,7 +1635,7 @@
     <w:link w:val="aa"/>
     <w:uiPriority w:val="30"/>
     <w:qFormat/>
-    <w:rsid w:val="00E9342F"/>
+    <w:rsid w:val="004565A2"/>
     <w:pPr>
       <w:pBdr>
         <w:top w:val="single" w:sz="4" w:space="10" w:color="2F5496" w:themeColor="accent1" w:themeShade="BF"/>
@@ -1705,7 +1656,7 @@
     <w:basedOn w:val="a0"/>
     <w:link w:val="a9"/>
     <w:uiPriority w:val="30"/>
-    <w:rsid w:val="00E9342F"/>
+    <w:rsid w:val="004565A2"/>
     <w:rPr>
       <w:i/>
       <w:iCs/>
@@ -1717,36 +1668,13 @@
     <w:basedOn w:val="a0"/>
     <w:uiPriority w:val="32"/>
     <w:qFormat/>
-    <w:rsid w:val="00E9342F"/>
+    <w:rsid w:val="004565A2"/>
     <w:rPr>
       <w:b/>
       <w:bCs/>
       <w:smallCaps/>
       <w:color w:val="2F5496" w:themeColor="accent1" w:themeShade="BF"/>
       <w:spacing w:val="5"/>
-    </w:rPr>
-  </w:style>
-  <w:style w:type="character" w:styleId="ac">
-    <w:name w:val="Hyperlink"/>
-    <w:basedOn w:val="a0"/>
-    <w:uiPriority w:val="99"/>
-    <w:unhideWhenUsed/>
-    <w:rsid w:val="009060FC"/>
-    <w:rPr>
-      <w:color w:val="0563C1" w:themeColor="hyperlink"/>
-      <w:u w:val="single"/>
-    </w:rPr>
-  </w:style>
-  <w:style w:type="character" w:styleId="ad">
-    <w:name w:val="Unresolved Mention"/>
-    <w:basedOn w:val="a0"/>
-    <w:uiPriority w:val="99"/>
-    <w:semiHidden/>
-    <w:unhideWhenUsed/>
-    <w:rsid w:val="009060FC"/>
-    <w:rPr>
-      <w:color w:val="605E5C"/>
-      <w:shd w:val="clear" w:color="auto" w:fill="E1DFDD"/>
     </w:rPr>
   </w:style>
 </w:styles>

</xml_diff>